<commit_message>
Fix sign frame position; fix T&C blank list items and table height
- Move main contract sig frame posY 0.65->0.47 (was landing below the table)
- Remove 3 blank numbered list items in T&C (were rendering as empty items 3,9,10)
- Reduce T&C signature table middle row height 2180->1200 twips to fit on page 13

Co-Authored-By: Claude Sonnet 4.6 <noreply@anthropic.com>
</commit_message>
<xml_diff>
--- a/Smlouva-LUNASTAV-vzor.docx
+++ b/Smlouva-LUNASTAV-vzor.docx
@@ -5391,18 +5391,21 @@
     <w:p>
       <w:pPr>
         <w:pStyle w:val="ListParagraph"/>
+        <w:jc w:val="both"/>
+      </w:pPr>
+    </w:p>
+    <w:p>
+      <w:pPr>
+        <w:pStyle w:val="ListParagraph"/>
         <w:numPr>
           <w:ilvl w:val="1"/>
           <w:numId w:val="5"/>
         </w:numPr>
         <w:jc w:val="both"/>
-        <w:pPrChange w:id="23" w:author="Tomáš Najman" w:date="2026-08-10T20:27:00Z" w16du:dateUtc="2026-08-10T18:27:00Z">
-          <w:pPr>
-            <w:pStyle w:val="ListParagraph"/>
-            <w:jc w:val="both"/>
-          </w:pPr>
-        </w:pPrChange>
-      </w:pPr>
+      </w:pPr>
+      <w:r>
+        <w:t xml:space="preserve">Zhotovitel není vázán žádnými kodexy chování. </w:t>
+      </w:r>
     </w:p>
     <w:p>
       <w:pPr>
@@ -5420,7 +5423,7 @@
         <w:jc w:val="both"/>
       </w:pPr>
       <w:r>
-        <w:t xml:space="preserve">Zhotovitel není vázán žádnými kodexy chování. </w:t>
+        <w:t xml:space="preserve">Zhotovitel je oprávněn k podnikání v rozsahu dle živnostenského oprávnění. Kontrolu provádí v rámci své působnosti příslušný živnostenský úřad. Dozor nad oblastí ochrany osobních údajů vykonává Úřad pro ochranu osobních údajů. Nad dodržováním zákona č. 634/1992 Sb., o ochraně spotřebitele, ve znění pozdějších předpisů, vykonává dozor Česká obchodní inspekce. </w:t>
       </w:r>
     </w:p>
     <w:p>
@@ -5439,7 +5442,7 @@
         <w:jc w:val="both"/>
       </w:pPr>
       <w:r>
-        <w:t xml:space="preserve">Zhotovitel je oprávněn k podnikání v rozsahu dle živnostenského oprávnění. Kontrolu provádí v rámci své působnosti příslušný živnostenský úřad. Dozor nad oblastí ochrany osobních údajů vykonává Úřad pro ochranu osobních údajů. Nad dodržováním zákona č. 634/1992 Sb., o ochraně spotřebitele, ve znění pozdějších předpisů, vykonává dozor Česká obchodní inspekce. </w:t>
+        <w:t xml:space="preserve">V případě, že kterékoliv ustanovení Smlouvy nebo těchto Podmínek bude nebo se stane neplatné či neúčinné, nemá to vliv na platnost a účinnost ostatních ustanovení Smlouvy a těchto Podmínek. </w:t>
       </w:r>
     </w:p>
     <w:p>
@@ -5458,13 +5461,12 @@
         <w:jc w:val="both"/>
       </w:pPr>
       <w:r>
-        <w:t xml:space="preserve">V případě, že kterékoliv ustanovení Smlouvy nebo těchto Podmínek bude nebo se stane neplatné či neúčinné, nemá to vliv na platnost a účinnost ostatních ustanovení Smlouvy a těchto Podmínek. </w:t>
-      </w:r>
-    </w:p>
-    <w:p>
-      <w:pPr>
-        <w:pStyle w:val="ListParagraph"/>
-        <w:jc w:val="both"/>
+        <w:t xml:space="preserve">Tyto Podmínky jsou uveřejněny na webových stránkách Společnosti: http://www.lunastav.cz/. Smluvní vztahy mezi Zhotovitelem a Objednatelem se řídí zněním Podmínek účinným ke dni uzavření Smlouvy. </w:t>
+      </w:r>
+    </w:p>
+    <w:p>
+      <w:pPr>
+        <w:pStyle w:val="ListParagraph"/>
       </w:pPr>
     </w:p>
     <w:p>
@@ -5475,24 +5477,6 @@
           <w:numId w:val="5"/>
         </w:numPr>
         <w:jc w:val="both"/>
-      </w:pPr>
-      <w:r>
-        <w:t xml:space="preserve">Tyto Podmínky jsou uveřejněny na webových stránkách Společnosti: http://www.lunastav.cz/. Smluvní vztahy mezi Zhotovitelem a Objednatelem se řídí zněním Podmínek účinným ke dni uzavření Smlouvy. </w:t>
-      </w:r>
-    </w:p>
-    <w:p>
-      <w:pPr>
-        <w:pStyle w:val="ListParagraph"/>
-      </w:pPr>
-    </w:p>
-    <w:p>
-      <w:pPr>
-        <w:pStyle w:val="ListParagraph"/>
-        <w:numPr>
-          <w:ilvl w:val="1"/>
-          <w:numId w:val="5"/>
-        </w:numPr>
-        <w:jc w:val="both"/>
         <w:rPr>
           <w:del w:id="24" w:author="Tomáš Najman" w:date="2026-08-10T20:27:00Z" w16du:dateUtc="2026-08-10T18:27:00Z"/>
         </w:rPr>
@@ -5503,42 +5487,6 @@
       <w:r>
         <w:t>2.2026</w:t>
       </w:r>
-    </w:p>
-    <w:p>
-      <w:pPr>
-        <w:pStyle w:val="ListParagraph"/>
-        <w:numPr>
-          <w:ilvl w:val="1"/>
-          <w:numId w:val="5"/>
-        </w:numPr>
-        <w:jc w:val="both"/>
-        <w:rPr>
-          <w:del w:id="25" w:author="Tomáš Najman" w:date="2026-08-10T20:25:00Z" w16du:dateUtc="2026-08-10T18:25:00Z"/>
-        </w:rPr>
-        <w:pPrChange w:id="26" w:author="Tomáš Najman" w:date="2026-08-10T20:27:00Z" w16du:dateUtc="2026-08-10T18:27:00Z">
-          <w:pPr>
-            <w:pStyle w:val="ListParagraph"/>
-            <w:jc w:val="both"/>
-          </w:pPr>
-        </w:pPrChange>
-      </w:pPr>
-    </w:p>
-    <w:p>
-      <w:pPr>
-        <w:pStyle w:val="ListParagraph"/>
-        <w:numPr>
-          <w:ilvl w:val="1"/>
-          <w:numId w:val="5"/>
-        </w:numPr>
-        <w:jc w:val="both"/>
-        <w:pPrChange w:id="27" w:author="Tomáš Najman" w:date="2026-08-10T20:27:00Z" w16du:dateUtc="2026-08-10T18:27:00Z">
-          <w:pPr>
-            <w:pStyle w:val="ListParagraph"/>
-            <w:ind w:left="360"/>
-            <w:jc w:val="both"/>
-          </w:pPr>
-        </w:pPrChange>
-      </w:pPr>
     </w:p>
     <w:p>
       <w:pPr>
@@ -5648,7 +5596,7 @@
       </w:tr>
       <w:tr>
         <w:trPr>
-          <w:trHeight w:val="2180"/>
+          <w:trHeight w:val="1200"/>
           <w:ins w:id="35" w:author="Tomáš Najman" w:date="2026-08-10T20:25:00Z" w16du:dateUtc="2026-08-10T18:25:00Z"/>
         </w:trPr>
         <w:tc>

</xml_diff>

<commit_message>
Use invisible anchor character for precise sign frame placement
Add a tiny white ◆ (U+25C6) centred in the signing box row of the main
contract signature table. pypdf visitor finds its exact Y coordinate in
the generated PDF, eliminating guesswork from varying Popis dila length.

Co-Authored-By: Claude Sonnet 4.6 <noreply@anthropic.com>
</commit_message>
<xml_diff>
--- a/Smlouva-LUNASTAV-vzor.docx
+++ b/Smlouva-LUNASTAV-vzor.docx
@@ -2264,8 +2264,20 @@
         <w:tc>
           <w:tcPr>
             <w:tcW w:w="4410" w:type="dxa"/>
+            <w:vAlign w:val="center"/>
           </w:tcPr>
-          <w:p/>
+          <w:p>
+            <w:pPr>
+              <w:jc w:val="center"/>
+            </w:pPr>
+            <w:r>
+              <w:rPr>
+                <w:sz w:val="12"/>
+                <w:color w:val="FFFFFF"/>
+              </w:rPr>
+              <w:t>◆</w:t>
+            </w:r>
+          </w:p>
         </w:tc>
         <w:tc>
           <w:tcPr>

</xml_diff>

<commit_message>
Add anchor logging + make anchor visible for posY calibration
SIGN_ANCHOR warning logs (anchor_y_pdf, page_h, anchor_posY, posY) now
appear in Railway logs after each contract generation.  The diamond
anchor in the signing box is temporarily black/10pt so its exact
position in the rendered PDF is visible.

Co-Authored-By: Claude Sonnet 4.6 <noreply@anthropic.com>
</commit_message>
<xml_diff>
--- a/Smlouva-LUNASTAV-vzor.docx
+++ b/Smlouva-LUNASTAV-vzor.docx
@@ -2272,8 +2272,8 @@
             </w:pPr>
             <w:r>
               <w:rPr>
-                <w:sz w:val="12"/>
-                <w:color w:val="FFFFFF"/>
+                <w:color w:val="000000"/>
+                <w:sz w:val="20"/>
               </w:rPr>
               <w:t>◆</w:t>
             </w:r>

</xml_diff>

<commit_message>
Dynamic anchor-based posY for both signing pages; fix offset to 0.03
- Refactor anchor detection into _anchor_posY_on_page() helper
- Parse PDF once; detect both contract page and T&C page posY from anchors
- Fix frame offset from 0.04 to 0.03 (half frame height = correct centering)
- Add invisible anchor to T&C signing table (body[246]) in DOCX template
- Anchors temporarily visible (black 10pt) for calibration

Co-Authored-By: Claude Sonnet 4.6 <noreply@anthropic.com>
</commit_message>
<xml_diff>
--- a/Smlouva-LUNASTAV-vzor.docx
+++ b/Smlouva-LUNASTAV-vzor.docx
@@ -5614,6 +5614,7 @@
         <w:tc>
           <w:tcPr>
             <w:tcW w:w="4410" w:type="dxa"/>
+            <w:vAlign w:val="center"/>
           </w:tcPr>
           <w:p>
             <w:pPr>
@@ -5621,6 +5622,13 @@
                 <w:ins w:id="36" w:author="Tomáš Najman" w:date="2026-08-10T20:25:00Z" w16du:dateUtc="2026-08-10T18:25:00Z"/>
               </w:rPr>
             </w:pPr>
+            <w:r>
+              <w:rPr>
+                <w:color w:val="000000"/>
+                <w:sz w:val="20"/>
+              </w:rPr>
+              <w:t>◆</w:t>
+            </w:r>
           </w:p>
         </w:tc>
         <w:tc>

</xml_diff>

<commit_message>
Make anchors invisible; fix posX to 0.15; swap checkboxes; remove duplicate email
- Anchors restored to white/6pt (calibration done)
- Left frame posX nudged from 0.13 to 0.15
- Address checkbox now above NZU checkbox
- Removed send_signature_accesses call — sign.request create already sends
  the invitation email; the extra call caused a duplicate 10s later

Co-Authored-By: Claude Sonnet 4.6 <noreply@anthropic.com>
</commit_message>
<xml_diff>
--- a/Smlouva-LUNASTAV-vzor.docx
+++ b/Smlouva-LUNASTAV-vzor.docx
@@ -2272,8 +2272,8 @@
             </w:pPr>
             <w:r>
               <w:rPr>
-                <w:color w:val="000000"/>
-                <w:sz w:val="20"/>
+                <w:color w:val="FFFFFF"/>
+                <w:sz w:val="12"/>
               </w:rPr>
               <w:t>◆</w:t>
             </w:r>
@@ -5624,8 +5624,8 @@
             </w:pPr>
             <w:r>
               <w:rPr>
-                <w:color w:val="000000"/>
-                <w:sz w:val="20"/>
+                <w:color w:val="FFFFFF"/>
+                <w:sz w:val="12"/>
               </w:rPr>
               <w:t>◆</w:t>
             </w:r>

</xml_diff>

<commit_message>
Taller sig fields (0.10h); DOCX sig rows 1200->1900twips; email subject; 1 ks D/5000A/B; strip qty decimals; require email; translate sign dialog
Co-Authored-By: Claude Sonnet 4.6 <noreply@anthropic.com>
</commit_message>
<xml_diff>
--- a/Smlouva-LUNASTAV-vzor.docx
+++ b/Smlouva-LUNASTAV-vzor.docx
@@ -2259,7 +2259,7 @@
       </w:tr>
       <w:tr>
         <w:trPr>
-          <w:trHeight w:val="1200"/>
+          <w:trHeight w:val="1900"/>
         </w:trPr>
         <w:tc>
           <w:tcPr>
@@ -5608,7 +5608,7 @@
       </w:tr>
       <w:tr>
         <w:trPr>
-          <w:trHeight w:val="1200"/>
+          <w:trHeight w:val="1900"/>
           <w:ins w:id="35" w:author="Tomáš Najman" w:date="2026-08-10T20:25:00Z" w16du:dateUtc="2026-08-10T18:25:00Z"/>
         </w:trPr>
         <w:tc>

</xml_diff>

<commit_message>
Increase signature row height 1900->2600 twips; overlay height 0.10->0.14
Co-Authored-By: Claude Sonnet 4.6 <noreply@anthropic.com>
</commit_message>
<xml_diff>
--- a/Smlouva-LUNASTAV-vzor.docx
+++ b/Smlouva-LUNASTAV-vzor.docx
@@ -2259,7 +2259,7 @@
       </w:tr>
       <w:tr>
         <w:trPr>
-          <w:trHeight w:val="1900"/>
+          <w:trHeight w:val="2600"/>
         </w:trPr>
         <w:tc>
           <w:tcPr>
@@ -5608,7 +5608,7 @@
       </w:tr>
       <w:tr>
         <w:trPr>
-          <w:trHeight w:val="1900"/>
+          <w:trHeight w:val="2600"/>
           <w:ins w:id="35" w:author="Tomáš Najman" w:date="2026-08-10T20:25:00Z" w16du:dateUtc="2026-08-10T18:25:00Z"/>
         </w:trPr>
         <w:tc>

</xml_diff>